<commit_message>
Remove point values from criteria guide docx, keep only qualitative standards
Hides per-item and per-area score breakdowns in the externally-distributed
세부평가기준_안내.docx so bidders can't game exact thresholds, while keeping
the 우수/보통/미흡 qualitative standards and the top-level 기술80+가격20=100
split, price formula, and negotiation threshold.

Co-Authored-By: Claude Sonnet 5 <noreply@anthropic.com>
</commit_message>
<xml_diff>
--- a/public/세부평가기준_안내.docx
+++ b/public/세부평가기준_안내.docx
@@ -2071,7 +2071,7 @@
         <w:pStyle w:val="Heading1"/>
       </w:pPr>
       <w:r>
-        <w:t xml:space="preserve">3. 일반부문 (10점)</w:t>
+        <w:t xml:space="preserve">3. 일반부문</w:t>
       </w:r>
     </w:p>
     <w:p>
@@ -2099,16 +2099,6 @@
         </w:rPr>
         <w:t xml:space="preserve">경영현황 및 재무안정성</w:t>
       </w:r>
-      <w:r>
-        <w:rPr>
-          <w:b/>
-          <w:bCs/>
-          <w:color w:val="595959"/>
-          <w:sz w:val="20"/>
-          <w:szCs w:val="20"/>
-        </w:rPr>
-        <w:t xml:space="preserve">  (4점)</w:t>
-      </w:r>
     </w:p>
     <w:tbl>
       <w:tblPr>
@@ -2400,16 +2390,6 @@
         </w:rPr>
         <w:t xml:space="preserve">사업수행실적 (순수 위탁교육 실적)</w:t>
       </w:r>
-      <w:r>
-        <w:rPr>
-          <w:b/>
-          <w:bCs/>
-          <w:color w:val="595959"/>
-          <w:sz w:val="20"/>
-          <w:szCs w:val="20"/>
-        </w:rPr>
-        <w:t xml:space="preserve">  (4점)</w:t>
-      </w:r>
     </w:p>
     <w:tbl>
       <w:tblPr>
@@ -2701,16 +2681,6 @@
         </w:rPr>
         <w:t xml:space="preserve">전담인력 배치계획 (PM/R&amp;R)</w:t>
       </w:r>
-      <w:r>
-        <w:rPr>
-          <w:b/>
-          <w:bCs/>
-          <w:color w:val="595959"/>
-          <w:sz w:val="20"/>
-          <w:szCs w:val="20"/>
-        </w:rPr>
-        <w:t xml:space="preserve">  (2점)</w:t>
-      </w:r>
     </w:p>
     <w:tbl>
       <w:tblPr>
@@ -2982,7 +2952,7 @@
         <w:pStyle w:val="Heading1"/>
       </w:pPr>
       <w:r>
-        <w:t xml:space="preserve">4. 콘텐츠부문 (25점)</w:t>
+        <w:t xml:space="preserve">4. 콘텐츠부문</w:t>
       </w:r>
     </w:p>
     <w:p>
@@ -3010,16 +2980,6 @@
         </w:rPr>
         <w:t xml:space="preserve">보유 콘텐츠 양·다양성 (직무/리더십/어학 등)</w:t>
       </w:r>
-      <w:r>
-        <w:rPr>
-          <w:b/>
-          <w:bCs/>
-          <w:color w:val="595959"/>
-          <w:sz w:val="20"/>
-          <w:szCs w:val="20"/>
-        </w:rPr>
-        <w:t xml:space="preserve">  (8점)</w:t>
-      </w:r>
     </w:p>
     <w:tbl>
       <w:tblPr>
@@ -3311,16 +3271,6 @@
         </w:rPr>
         <w:t xml:space="preserve">콘텐츠 최신성 및 업데이트 주기 (법정필수교육 포함)</w:t>
       </w:r>
-      <w:r>
-        <w:rPr>
-          <w:b/>
-          <w:bCs/>
-          <w:color w:val="595959"/>
-          <w:sz w:val="20"/>
-          <w:szCs w:val="20"/>
-        </w:rPr>
-        <w:t xml:space="preserve">  (6점)</w:t>
-      </w:r>
     </w:p>
     <w:tbl>
       <w:tblPr>
@@ -3612,16 +3562,6 @@
         </w:rPr>
         <w:t xml:space="preserve">생성형 AI·데이터 리터러시 등 신기술 콘텐츠 보유/개발계획</w:t>
       </w:r>
-      <w:r>
-        <w:rPr>
-          <w:b/>
-          <w:bCs/>
-          <w:color w:val="595959"/>
-          <w:sz w:val="20"/>
-          <w:szCs w:val="20"/>
-        </w:rPr>
-        <w:t xml:space="preserve">  (6점)</w:t>
-      </w:r>
     </w:p>
     <w:tbl>
       <w:tblPr>
@@ -3913,16 +3853,6 @@
         </w:rPr>
         <w:t xml:space="preserve">자체 제작 콘텐츠 무상 탑재 및 운영 지원</w:t>
       </w:r>
-      <w:r>
-        <w:rPr>
-          <w:b/>
-          <w:bCs/>
-          <w:color w:val="595959"/>
-          <w:sz w:val="20"/>
-          <w:szCs w:val="20"/>
-        </w:rPr>
-        <w:t xml:space="preserve">  (5점)</w:t>
-      </w:r>
     </w:p>
     <w:tbl>
       <w:tblPr>
@@ -4194,7 +4124,7 @@
         <w:pStyle w:val="Heading1"/>
       </w:pPr>
       <w:r>
-        <w:t xml:space="preserve">5. 운영부문 (25점)</w:t>
+        <w:t xml:space="preserve">5. 운영부문</w:t>
       </w:r>
     </w:p>
     <w:p>
@@ -4222,16 +4152,6 @@
         </w:rPr>
         <w:t xml:space="preserve">운영전략 및 추진계획의 타당성</w:t>
       </w:r>
-      <w:r>
-        <w:rPr>
-          <w:b/>
-          <w:bCs/>
-          <w:color w:val="595959"/>
-          <w:sz w:val="20"/>
-          <w:szCs w:val="20"/>
-        </w:rPr>
-        <w:t xml:space="preserve">  (5점)</w:t>
-      </w:r>
     </w:p>
     <w:tbl>
       <w:tblPr>
@@ -4523,16 +4443,6 @@
         </w:rPr>
         <w:t xml:space="preserve">학습독려 및 참여활성화 방안</w:t>
       </w:r>
-      <w:r>
-        <w:rPr>
-          <w:b/>
-          <w:bCs/>
-          <w:color w:val="595959"/>
-          <w:sz w:val="20"/>
-          <w:szCs w:val="20"/>
-        </w:rPr>
-        <w:t xml:space="preserve">  (5점)</w:t>
-      </w:r>
     </w:p>
     <w:tbl>
       <w:tblPr>
@@ -4824,16 +4734,6 @@
         </w:rPr>
         <w:t xml:space="preserve">학습자 관리 (콜센터 09~18시, VOC 대응) 체계</w:t>
       </w:r>
-      <w:r>
-        <w:rPr>
-          <w:b/>
-          <w:bCs/>
-          <w:color w:val="595959"/>
-          <w:sz w:val="20"/>
-          <w:szCs w:val="20"/>
-        </w:rPr>
-        <w:t xml:space="preserve">  (5점)</w:t>
-      </w:r>
     </w:p>
     <w:tbl>
       <w:tblPr>
@@ -5125,16 +5025,6 @@
         </w:rPr>
         <w:t xml:space="preserve">교육결과 보고 및 사후관리 체계</w:t>
       </w:r>
-      <w:r>
-        <w:rPr>
-          <w:b/>
-          <w:bCs/>
-          <w:color w:val="595959"/>
-          <w:sz w:val="20"/>
-          <w:szCs w:val="20"/>
-        </w:rPr>
-        <w:t xml:space="preserve">  (5점)</w:t>
-      </w:r>
     </w:p>
     <w:tbl>
       <w:tblPr>
@@ -5426,16 +5316,6 @@
         </w:rPr>
         <w:t xml:space="preserve">부가서비스 (부정수강 모니터링, 맞춤 추천 등)</w:t>
       </w:r>
-      <w:r>
-        <w:rPr>
-          <w:b/>
-          <w:bCs/>
-          <w:color w:val="595959"/>
-          <w:sz w:val="20"/>
-          <w:szCs w:val="20"/>
-        </w:rPr>
-        <w:t xml:space="preserve">  (5점)</w:t>
-      </w:r>
     </w:p>
     <w:tbl>
       <w:tblPr>
@@ -5707,7 +5587,7 @@
         <w:pStyle w:val="Heading1"/>
       </w:pPr>
       <w:r>
-        <w:t xml:space="preserve">6. 시스템부문 (20점)</w:t>
+        <w:t xml:space="preserve">6. 시스템부문</w:t>
       </w:r>
     </w:p>
     <w:p>
@@ -5735,16 +5615,6 @@
         </w:rPr>
         <w:t xml:space="preserve">웹/모바일 학습 플랫폼 사용 편의성</w:t>
       </w:r>
-      <w:r>
-        <w:rPr>
-          <w:b/>
-          <w:bCs/>
-          <w:color w:val="595959"/>
-          <w:sz w:val="20"/>
-          <w:szCs w:val="20"/>
-        </w:rPr>
-        <w:t xml:space="preserve">  (5점)</w:t>
-      </w:r>
     </w:p>
     <w:tbl>
       <w:tblPr>
@@ -6036,16 +5906,6 @@
         </w:rPr>
         <w:t xml:space="preserve">해외법인 (인도네시아·캄보디아 등) 접속 지원 등 안정성</w:t>
       </w:r>
-      <w:r>
-        <w:rPr>
-          <w:b/>
-          <w:bCs/>
-          <w:color w:val="595959"/>
-          <w:sz w:val="20"/>
-          <w:szCs w:val="20"/>
-        </w:rPr>
-        <w:t xml:space="preserve">  (5점)</w:t>
-      </w:r>
     </w:p>
     <w:tbl>
       <w:tblPr>
@@ -6337,16 +6197,6 @@
         </w:rPr>
         <w:t xml:space="preserve">정보보안 대책 (개인정보보호, DB보안)</w:t>
       </w:r>
-      <w:r>
-        <w:rPr>
-          <w:b/>
-          <w:bCs/>
-          <w:color w:val="595959"/>
-          <w:sz w:val="20"/>
-          <w:szCs w:val="20"/>
-        </w:rPr>
-        <w:t xml:space="preserve">  (6점)</w:t>
-      </w:r>
     </w:p>
     <w:tbl>
       <w:tblPr>
@@ -6638,16 +6488,6 @@
         </w:rPr>
         <w:t xml:space="preserve">장애대응 및 유지보수 체계</w:t>
       </w:r>
-      <w:r>
-        <w:rPr>
-          <w:b/>
-          <w:bCs/>
-          <w:color w:val="595959"/>
-          <w:sz w:val="20"/>
-          <w:szCs w:val="20"/>
-        </w:rPr>
-        <w:t xml:space="preserve">  (4점)</w:t>
-      </w:r>
     </w:p>
     <w:tbl>
       <w:tblPr>
@@ -6919,7 +6759,7 @@
         <w:pStyle w:val="Heading1"/>
       </w:pPr>
       <w:r>
-        <w:t xml:space="preserve">7. 가격평가 (20점)</w:t>
+        <w:t xml:space="preserve">7. 가격평가</w:t>
       </w:r>
     </w:p>
     <w:p>

</xml_diff>